<commit_message>
Align CV with AI design systems and leadership profile
</commit_message>
<xml_diff>
--- a/dist/client/output/cv/Nikita_Mukhortov_Product_Design_Lead_CV_EN.docx
+++ b/dist/client/output/cv/Nikita_Mukhortov_Product_Design_Lead_CV_EN.docx
@@ -81,11 +81,11 @@
         <w:rPr>
           <w:lang w:val="en-US"/>
         </w:rPr>
-        <w:t>Product: product strategy, product discovery, roadmapping, KPI definition, product analytics, experimentation, A/B testing, go-to-market, product launch, post-launch review.</w:t>
+        <w:t>Product: product management, product strategy, product discovery, roadmapping, KPI definition, product analytics, experimentation, A/B testing, go-to-market, product launch, post-launch review.</w:t>
         <w:br/>
-        <w:t>Design and research: AI product design, AI UX, generative AI, LLM UX, agentic workflows, human-AI interaction, developer tools, platform design, internal tools, systems design, user research, usability testing, interaction design, service design, design systems, coded prototyping, Figma, Framer, Amplitude.</w:t>
+        <w:t>Design and research: AI product design, AI UX, generative AI, LLM UX, agentic workflows, human-AI interaction, developer tools, platform design, qualitative and quantitative user research, participatory design, usability testing, interaction design, AI design systems, coded prototyping, Figma, Framer, Amplitude.</w:t>
         <w:br/>
-        <w:t>Leadership: cross-functional leadership, Product/Engineering/Research/Data collaboration, stakeholder management, people management, design team leadership, mentoring, design operations, B2B SaaS, fintech, marketplaces, consumer products, blockchain, Web3.</w:t>
+        <w:t>Leadership: cross-functional leadership, Product/Engineering/Research/Data collaboration, stakeholder management, people management, design team leadership, mentoring, design operations, B2B SaaS, fintech, marketplaces, consumer products, blockchain, Web3, creative direction, marketing design, motion design.</w:t>
       </w:r>
     </w:p>
     <w:p>
@@ -149,6 +149,21 @@
         <w:rPr>
           <w:lang w:val="en-US"/>
         </w:rPr>
+        <w:t>Built a shared AI design system for developer tools: context selection, inspectable plans, execution control, evidence review, correction, and recovery.</w:t>
+      </w:r>
+    </w:p>
+    <w:p>
+      <w:pPr>
+        <w:pStyle w:val="CVBullet"/>
+        <w:numPr>
+          <w:ilvl w:val="0"/>
+          <w:numId w:val="10"/>
+        </w:numPr>
+      </w:pPr>
+      <w:r>
+        <w:rPr>
+          <w:lang w:val="en-US"/>
+        </w:rPr>
         <w:t>Owned Agentic Markdown end to end: developer research, product framing, a coded five-stage prototype, moderated validation, and a public waitlist test.</w:t>
       </w:r>
     </w:p>
@@ -191,7 +206,7 @@
         <w:rPr>
           <w:lang w:val="en-US"/>
         </w:rPr>
-        <w:t>JetBrains | Product Design Lead, Rider / .NET Ecosystem</w:t>
+        <w:t>JetBrains | Product Designer / Product Design Lead, Rider / .NET</w:t>
       </w:r>
     </w:p>
     <w:p>
@@ -413,7 +428,7 @@
         <w:rPr>
           <w:lang w:val="en-US"/>
         </w:rPr>
-        <w:t>Took the transaction service from research and service blueprint through prototype, cross-functional delivery, and launch with Tinkoff in Oct 2021; the published online process took up to 15 minutes.</w:t>
+        <w:t>Took the transaction service from research and service blueprint through prototype and cross-functional delivery. Auto.ru launched it with Tinkoff in Oct 2021; the published online process took up to 15 minutes.</w:t>
       </w:r>
     </w:p>
     <w:p>

</xml_diff>

<commit_message>
Update portfolio contact actions, Wallet narrative, and English CV
</commit_message>
<xml_diff>
--- a/dist/client/output/cv/Nikita_Mukhortov_Product_Design_Lead_CV_EN.docx
+++ b/dist/client/output/cv/Nikita_Mukhortov_Product_Design_Lead_CV_EN.docx
@@ -59,7 +59,7 @@
         <w:rPr>
           <w:lang w:val="en-US"/>
         </w:rPr>
-        <w:t>Product Design Lead and hands-on staff-level designer with 9+ years of experience taking AI products, developer tools, fintech, marketplaces, telecom, consumer, blockchain, and Web3 products from discovery and strategy through research, interaction design, coded prototyping, validation, delivery, launch, and post-launch review. Former software developer who leads cross-functional work and manages design teams across hiring, goals, performance reviews, development, compensation, and team composition while remaining hands-on. Selected team-level outcomes include 29,370 public-preview installs, 901,015 registered wallets in a launch quarter, and 500,000 active subscribers.</w:t>
+        <w:t>Product Design Lead and hands-on staff-level designer with 9+ years of experience taking AI products, developer tools, fintech, marketplaces, telecom, consumer, blockchain, and Web3 products from discovery and strategy through research, interaction design, coded prototyping, validation, delivery, launch, and post-launch review. Former software developer who leads cross-functional work and manages design teams across hiring, goals, performance reviews, development, compensation, and team composition while remaining hands-on. Selected product milestones include 29,370 public-preview installs and 500,000 active subscribers.</w:t>
       </w:r>
     </w:p>
     <w:p>
@@ -345,7 +345,7 @@
         <w:rPr>
           <w:lang w:val="en-US"/>
         </w:rPr>
-        <w:t>Led four core Wallet journeys - onboarding, portfolio, contact-based transfers, and exchange - and integrated them into Telegram. Registered TON wallets grew from 382,148 to 901,015 in the launch quarter (+136%; team-level product result).</w:t>
+        <w:t>Led four core Wallet journeys - onboarding, portfolio, contact-based transfers, and exchange - and integrated them into Telegram. During that quarter, registered wallets across the TON network grew from 382,148 to 901,015 (+136%).</w:t>
       </w:r>
     </w:p>
     <w:p>

</xml_diff>

<commit_message>
Describe design systems and visual identity ownership in case studies and CV
</commit_message>
<xml_diff>
--- a/dist/client/output/cv/Nikita_Mukhortov_Product_Design_Lead_CV_EN.docx
+++ b/dist/client/output/cv/Nikita_Mukhortov_Product_Design_Lead_CV_EN.docx
@@ -83,7 +83,7 @@
         </w:rPr>
         <w:t>Product: product management, product strategy, product discovery, roadmapping, KPI definition, product analytics, experimentation, A/B testing, go-to-market, product launch, post-launch review.</w:t>
         <w:br/>
-        <w:t>Design and research: AI product design, AI UX, generative AI, LLM UX, agentic workflows, human-AI interaction, developer tools, platform design, qualitative and quantitative user research, participatory design, usability testing, interaction design, AI design systems, coded prototyping, Figma, Framer, Amplitude.</w:t>
+        <w:t>Design and research: AI product design, AI UX, generative AI, LLM UX, agentic workflows, human-AI interaction, developer tools, platform design, qualitative and quantitative user research, participatory design, usability testing, interaction design, AI design systems, visual identity, AI-assisted prototyping, Figma, Framer, Amplitude.</w:t>
         <w:br/>
         <w:t>Leadership: cross-functional leadership, Product/Engineering/Research/Data collaboration, stakeholder management, people management, design team leadership, mentoring, design operations, B2B SaaS, fintech, marketplaces, consumer products, blockchain, Web3, creative direction, marketing design, motion design.</w:t>
       </w:r>
@@ -149,7 +149,7 @@
         <w:rPr>
           <w:lang w:val="en-US"/>
         </w:rPr>
-        <w:t>Built a shared AI design system for developer tools: context selection, inspectable plans, execution control, evidence review, correction, and recovery.</w:t>
+        <w:t>Created a new visual identity and shared AI design system for developer tools: context selection, inspectable plans, execution control, evidence review, correction, and recovery.</w:t>
       </w:r>
     </w:p>
     <w:p>
@@ -164,7 +164,7 @@
         <w:rPr>
           <w:lang w:val="en-US"/>
         </w:rPr>
-        <w:t>Owned Agentic Markdown end to end: developer research, product framing, a coded five-stage prototype, moderated validation, and a public waitlist test.</w:t>
+        <w:t>Owned Agentic Markdown from research and product framing through visual identity, prototype design system, a coded five-stage workflow, moderated validation, and a public waitlist test.</w:t>
       </w:r>
     </w:p>
     <w:p>
@@ -194,7 +194,7 @@
         <w:rPr>
           <w:lang w:val="en-US"/>
         </w:rPr>
-        <w:t>Built two reusable prototyping skills that convert dynamic web concepts into credible JetBrains IDE research instruments, scaling the approach across company research and providing a foundation for a full product launch.</w:t>
+        <w:t>Created the code-review prototype's visual identity and an internal AI-assisted design system with two agent skills, substantially reducing prototype preparation time and accelerating hypothesis validation across JetBrains research.</w:t>
       </w:r>
     </w:p>
     <w:p>
@@ -292,6 +292,21 @@
         <w:rPr>
           <w:lang w:val="en-US"/>
         </w:rPr>
+        <w:t>Created visual identities and design systems from scratch for both AI Assistant for VS Code and ReSharper AI, adapting reusable components and states to each host IDE.</w:t>
+      </w:r>
+    </w:p>
+    <w:p>
+      <w:pPr>
+        <w:pStyle w:val="CVBullet"/>
+        <w:numPr>
+          <w:ilvl w:val="0"/>
+          <w:numId w:val="10"/>
+        </w:numPr>
+      </w:pPr>
+      <w:r>
+        <w:rPr>
+          <w:lang w:val="en-US"/>
+        </w:rPr>
         <w:t>During the Rider product period, surveyed primary-IDE share increased from 35% to 44% as a team-level adoption outcome.</w:t>
       </w:r>
     </w:p>
@@ -330,7 +345,7 @@
         <w:rPr>
           <w:lang w:val="en-US"/>
         </w:rPr>
-        <w:t>Rebuilt TON Foundation's public product around four audience activation paths, live network proof, working use cases, and builder tools; 115 validators were active at relaunch.</w:t>
+        <w:t>Created the visual identities for TON Foundation and TOP from scratch. Rebuilt TON's public product around four audience activation paths and live network proof; 115 validators were active at relaunch.</w:t>
       </w:r>
     </w:p>
     <w:p>
@@ -345,7 +360,7 @@
         <w:rPr>
           <w:lang w:val="en-US"/>
         </w:rPr>
-        <w:t>Led four core Wallet journeys - onboarding, portfolio, contact-based transfers, and exchange - and integrated them into Telegram. During that quarter, registered wallets across the TON network grew from 382,148 to 901,015 (+136%).</w:t>
+        <w:t>Created TON Wallet's visual identity from scratch and led onboarding, portfolio, contact-based transfers, exchange, and Telegram integration. During that quarter, registered wallets across TON grew from 382,148 to 901,015 (+136%).</w:t>
       </w:r>
     </w:p>
     <w:p>
@@ -519,7 +534,7 @@
         <w:rPr>
           <w:lang w:val="en-US"/>
         </w:rPr>
-        <w:t>Used research, Amplitude analysis, experimentation, and subscription UX to help pivot the product from a fasting timer to a personalized daily program across iOS, Android, Web, and watchOS.</w:t>
+        <w:t>Created Simple's complete visual identity from scratch. Used research, Amplitude analysis, experimentation, and subscription UX to shape the pivot from a fasting timer to a daily program across iOS, Android, Web, and watchOS.</w:t>
       </w:r>
     </w:p>
     <w:p>
@@ -640,7 +655,7 @@
         <w:rPr>
           <w:lang w:val="en-US"/>
         </w:rPr>
-        <w:t>Created one reusable service model across web, desktop, and mobile product surfaces for a business unit that reported 53,000 active medium-business clients, 46% annual client growth, and RUB 19B operating revenue in 2018.</w:t>
+        <w:t>Created a new visual identity, design system, and reusable service model across web, desktop, and mobile. The business unit reported 53,000 active medium-business clients, 46% annual client growth, and RUB 19B operating revenue in 2018.</w:t>
       </w:r>
     </w:p>
     <w:p>

</xml_diff>

<commit_message>
Clarify Simple and TON Wallet design systems in cases and CV
</commit_message>
<xml_diff>
--- a/dist/client/output/cv/Nikita_Mukhortov_Product_Design_Lead_CV_EN.docx
+++ b/dist/client/output/cv/Nikita_Mukhortov_Product_Design_Lead_CV_EN.docx
@@ -360,7 +360,7 @@
         <w:rPr>
           <w:lang w:val="en-US"/>
         </w:rPr>
-        <w:t>Created TON Wallet's visual identity from scratch and led onboarding, portfolio, contact-based transfers, exchange, and Telegram integration. During that quarter, registered wallets across TON grew from 382,148 to 901,015 (+136%).</w:t>
+        <w:t>Created TON Wallet's visual identity and design system from scratch; led onboarding, portfolio, contact-based transfers, exchange, and Telegram integration. During that quarter, registered wallets across TON grew from 382,148 to 901,015 (+136%).</w:t>
       </w:r>
     </w:p>
     <w:p>
@@ -534,7 +534,7 @@
         <w:rPr>
           <w:lang w:val="en-US"/>
         </w:rPr>
-        <w:t>Created Simple's complete visual identity from scratch. Used research, Amplitude analysis, experimentation, and subscription UX to shape the pivot from a fasting timer to a daily program across iOS, Android, Web, and watchOS.</w:t>
+        <w:t>Created Simple's visual identity and design system from scratch. Used research, Amplitude analysis, experimentation, and subscription UX to shape the pivot from a fasting timer to a daily program across iOS, Android, Web, and watchOS.</w:t>
       </w:r>
     </w:p>
     <w:p>

</xml_diff>

<commit_message>
Keep identity and design systems as brief supporting details
</commit_message>
<xml_diff>
--- a/dist/client/output/cv/Nikita_Mukhortov_Product_Design_Lead_CV_EN.docx
+++ b/dist/client/output/cv/Nikita_Mukhortov_Product_Design_Lead_CV_EN.docx
@@ -149,7 +149,7 @@
         <w:rPr>
           <w:lang w:val="en-US"/>
         </w:rPr>
-        <w:t>Created a new visual identity and shared AI design system for developer tools: context selection, inspectable plans, execution control, evidence review, correction, and recovery.</w:t>
+        <w:t>Built shared AI interaction patterns for context selection, inspectable plans, execution control, evidence review, correction, and recovery.</w:t>
       </w:r>
     </w:p>
     <w:p>
@@ -164,7 +164,7 @@
         <w:rPr>
           <w:lang w:val="en-US"/>
         </w:rPr>
-        <w:t>Owned Agentic Markdown from research and product framing through visual identity, prototype design system, a coded five-stage workflow, moderated validation, and a public waitlist test.</w:t>
+        <w:t>Owned Agentic Markdown end to end: developer research, product framing, a coded five-stage prototype, moderated validation, and a public waitlist test.</w:t>
       </w:r>
     </w:p>
     <w:p>
@@ -194,7 +194,7 @@
         <w:rPr>
           <w:lang w:val="en-US"/>
         </w:rPr>
-        <w:t>Created the code-review prototype's visual identity and an internal AI-assisted design system with two agent skills, substantially reducing prototype preparation time and accelerating hypothesis validation across JetBrains research.</w:t>
+        <w:t>Also developed the research prototype's visual identity and an internal AI-assisted design system, speeding up prototype preparation and hypothesis validation.</w:t>
       </w:r>
     </w:p>
     <w:p>
@@ -292,7 +292,7 @@
         <w:rPr>
           <w:lang w:val="en-US"/>
         </w:rPr>
-        <w:t>Created visual identities and design systems from scratch for both AI Assistant for VS Code and ReSharper AI, adapting reusable components and states to each host IDE.</w:t>
+        <w:t>Also built visual identities and design systems from scratch for AI Assistant for VS Code and ReSharper AI.</w:t>
       </w:r>
     </w:p>
     <w:p>
@@ -345,7 +345,7 @@
         <w:rPr>
           <w:lang w:val="en-US"/>
         </w:rPr>
-        <w:t>Created the visual identities for TON Foundation and TOP from scratch. Rebuilt TON's public product around four audience activation paths and live network proof; 115 validators were active at relaunch.</w:t>
+        <w:t>Rebuilt TON's public product around four audience activation paths and live network proof; 115 validators were active at relaunch. Also created the TON Foundation and TOP visual identities from scratch.</w:t>
       </w:r>
     </w:p>
     <w:p>
@@ -360,7 +360,7 @@
         <w:rPr>
           <w:lang w:val="en-US"/>
         </w:rPr>
-        <w:t>Created TON Wallet's visual identity and design system from scratch; led onboarding, portfolio, contact-based transfers, exchange, and Telegram integration. During that quarter, registered wallets across TON grew from 382,148 to 901,015 (+136%).</w:t>
+        <w:t>Led TON Wallet's onboarding, portfolio, contact-based transfers, exchange, and Telegram integration, including its new visual identity and design system. During that quarter, registered wallets across TON grew from 382,148 to 901,015 (+136%).</w:t>
       </w:r>
     </w:p>
     <w:p>
@@ -534,7 +534,7 @@
         <w:rPr>
           <w:lang w:val="en-US"/>
         </w:rPr>
-        <w:t>Created Simple's visual identity and design system from scratch. Used research, Amplitude analysis, experimentation, and subscription UX to shape the pivot from a fasting timer to a daily program across iOS, Android, Web, and watchOS.</w:t>
+        <w:t>Used research, Amplitude analysis, experimentation, and subscription UX to shape Simple's pivot from a fasting timer to a daily program across iOS, Android, Web, and watchOS. Also built its visual identity and design system from scratch.</w:t>
       </w:r>
     </w:p>
     <w:p>

</xml_diff>

<commit_message>
Align Staff positioning and verify recruitment evidence
</commit_message>
<xml_diff>
--- a/dist/client/output/cv/Nikita_Mukhortov_Product_Design_Lead_CV_EN.docx
+++ b/dist/client/output/cv/Nikita_Mukhortov_Product_Design_Lead_CV_EN.docx
@@ -21,7 +21,7 @@
         <w:rPr>
           <w:lang w:val="en-US"/>
         </w:rPr>
-        <w:t>Product Design Lead / Staff Product Designer | AI, Developer Tools, Fintech</w:t>
+        <w:t>Staff Product Designer | AI &amp; Developer Tools</w:t>
       </w:r>
     </w:p>
     <w:p>
@@ -59,7 +59,7 @@
         <w:rPr>
           <w:lang w:val="en-US"/>
         </w:rPr>
-        <w:t>Product Design Lead and hands-on staff-level designer with 9+ years of experience taking AI products, developer tools, fintech, marketplaces, telecom, consumer, blockchain, and Web3 products from discovery and strategy through research, interaction design, coded prototyping, validation, delivery, launch, and post-launch review. Former software developer who leads cross-functional work and manages design teams across hiring, goals, performance reviews, development, compensation, and team composition while remaining hands-on. Selected product milestones include 29,370 public-preview installs and 500,000 active subscribers.</w:t>
+        <w:t>Hands-on product designer with 9+ years across software development and product design, focused on AI and developer tools. I turn ambiguous problems into product direction, working prototypes and shipped experiences with Product, Engineering and Research. Experience spans complex workflows, cross-product design systems and 0-to-1 launches, with earlier work in fintech and Web3. Co-author of research evaluated with 43 professional developers; former software developer and design-team manager.</w:t>
       </w:r>
     </w:p>
     <w:p>
@@ -81,11 +81,11 @@
         <w:rPr>
           <w:lang w:val="en-US"/>
         </w:rPr>
-        <w:t>Product: product management, product strategy, product discovery, roadmapping, KPI definition, product analytics, experimentation, A/B testing, go-to-market, product launch, post-launch review.</w:t>
+        <w:t>Product design: interaction design, information architecture, systems design, design systems, AI UX, generative AI, LLM workflows, human-AI interaction, developer tools, coded prototyping.</w:t>
         <w:br/>
-        <w:t>Design and research: AI product design, AI UX, generative AI, LLM UX, agentic workflows, human-AI interaction, developer tools, platform design, qualitative and quantitative user research, participatory design, usability testing, interaction design, AI design systems, visual identity, AI-assisted prototyping, Figma, Framer, Amplitude.</w:t>
+        <w:t>Strategy and research: product strategy, product discovery, qualitative and quantitative user research, participatory design, usability testing, experimentation, product analytics, product management, 0-to-1 launches.</w:t>
         <w:br/>
-        <w:t>Leadership: cross-functional leadership, Product/Engineering/Research/Data collaboration, stakeholder management, people management, design team leadership, mentoring, design operations, B2B SaaS, fintech, marketplaces, consumer products, blockchain, Web3, creative direction, marketing design, motion design.</w:t>
+        <w:t>Collaboration and tools: cross-functional leadership, stakeholder alignment, mentoring, people management; Figma, Framer, Amplitude. Supporting craft: visual identity, creative direction, marketing and motion design.</w:t>
       </w:r>
     </w:p>
     <w:p>
@@ -134,22 +134,7 @@
         <w:rPr>
           <w:lang w:val="en-US"/>
         </w:rPr>
-        <w:t>Established a product design function in R&amp;D and introduced coded prototyping with Research and Product Management to validate complete AI interactions before engineering investment.</w:t>
-      </w:r>
-    </w:p>
-    <w:p>
-      <w:pPr>
-        <w:pStyle w:val="CVBullet"/>
-        <w:numPr>
-          <w:ilvl w:val="0"/>
-          <w:numId w:val="10"/>
-        </w:numPr>
-      </w:pPr>
-      <w:r>
-        <w:rPr>
-          <w:lang w:val="en-US"/>
-        </w:rPr>
-        <w:t>Built shared AI interaction patterns for context selection, inspectable plans, execution control, evidence review, correction, and recovery.</w:t>
+        <w:t>Established product design in R&amp;D; partnered with Research, Product Management and Engineering to test complete AI workflows before production investment.</w:t>
       </w:r>
     </w:p>
     <w:p>
@@ -179,7 +164,7 @@
         <w:rPr>
           <w:lang w:val="en-US"/>
         </w:rPr>
-        <w:t>Co-authored Trust-Calibrated Code Review; translated 64 practitioner problems from 17 discovery participants into a validated three-level IDE workflow tested with 43 professionals. 72% would use the proposed tool, 63% expected lower overall review effort, and 52% expected lower trust-assessment effort.</w:t>
+        <w:t>Co-authored Trust-Calibrated Code Review and designed its IDE prototype: 17 discovery participants, 64 review challenges, 43 validation respondents; 72% said they would use the tool. Published as an arXiv preprint in June 2026.</w:t>
       </w:r>
     </w:p>
     <w:p>
@@ -194,7 +179,7 @@
         <w:rPr>
           <w:lang w:val="en-US"/>
         </w:rPr>
-        <w:t>Also developed the research prototype's visual identity and an internal AI-assisted design system, speeding up prototype preparation and hypothesis validation.</w:t>
+        <w:t>Built shared patterns for context, plans, execution control and evidence review, plus an internal AI-assisted design system that made IDE prototypes and hypothesis validation faster to prepare.</w:t>
       </w:r>
     </w:p>
     <w:p>
@@ -206,7 +191,7 @@
         <w:rPr>
           <w:lang w:val="en-US"/>
         </w:rPr>
-        <w:t>JetBrains | Product Designer / Product Design Lead, Rider / .NET</w:t>
+        <w:t>JetBrains | Product Design Lead, Rider / .NET Ecosystem</w:t>
       </w:r>
     </w:p>
     <w:p>
@@ -217,7 +202,7 @@
         <w:rPr>
           <w:lang w:val="en-US"/>
         </w:rPr>
-        <w:t>Sep 2022 - Sep 2025 | Amsterdam, Netherlands</w:t>
+        <w:t>Sep 2024 - Sep 2025 | Amsterdam, Netherlands</w:t>
       </w:r>
     </w:p>
     <w:p>
@@ -232,7 +217,7 @@
         <w:rPr>
           <w:lang w:val="en-US"/>
         </w:rPr>
-        <w:t>Built Rider's product-design operating model and managed three product designers, owning hiring, goals, performance reviews, development, compensation, and team composition while remaining hands-on; embedded research, prototyping, handoff, design review, and release-quality review into delivery.</w:t>
+        <w:t>Led hands-on design across Rider, .NET and VS Code, connecting contextual AI, agent workflows and Monitoring through shared interaction patterns and release reviews.</w:t>
       </w:r>
     </w:p>
     <w:p>
@@ -247,7 +232,7 @@
         <w:rPr>
           <w:lang w:val="en-US"/>
         </w:rPr>
-        <w:t>Led product design across three shipped product initiatives: contextual AI, agent workflows, and Monitoring. Monitoring shipped in Rider 2024.1, 2024.2, and 2025.2.</w:t>
+        <w:t>Led AI Assistant for VS Code from product framing to public preview across eight languages; created its visual identity and design system from scratch. The extension recorded 29,370 unique Marketplace installs by 24 Aug 2026.</w:t>
       </w:r>
     </w:p>
     <w:p>
@@ -262,7 +247,30 @@
         <w:rPr>
           <w:lang w:val="en-US"/>
         </w:rPr>
-        <w:t>Designed and launched ReSharper AI Assistant in 2023.2 across four workflow groups and three native entry paths; the host product has 3.03M cumulative Marketplace installs and a 4.3/5 rating.</w:t>
+        <w:t>Managed three product designers: hiring, individual goals, performance reviews, development, compensation and team composition. Embedded discovery, prototyping and design-quality reviews into product delivery.</w:t>
+      </w:r>
+    </w:p>
+    <w:p>
+      <w:pPr>
+        <w:pStyle w:val="CVRole"/>
+        <w:pageBreakBefore w:val="0"/>
+      </w:pPr>
+      <w:r>
+        <w:rPr>
+          <w:lang w:val="en-US"/>
+        </w:rPr>
+        <w:t>JetBrains | Product Designer, .NET Ecosystem</w:t>
+      </w:r>
+    </w:p>
+    <w:p>
+      <w:pPr>
+        <w:pStyle w:val="CVMeta"/>
+      </w:pPr>
+      <w:r>
+        <w:rPr>
+          <w:lang w:val="en-US"/>
+        </w:rPr>
+        <w:t>Sep 2022 - Sep 2024 | Munich, Germany</w:t>
       </w:r>
     </w:p>
     <w:p>
@@ -277,7 +285,7 @@
         <w:rPr>
           <w:lang w:val="en-US"/>
         </w:rPr>
-        <w:t>Led the AI Assistant for VS Code product model and public-preview launch across eight languages; the extension reached 29,370 unique Marketplace installs by 24 Aug 2026.</w:t>
+        <w:t>Designed the first ReSharper AI Assistant for release 2023.2: contextual chat, explanation, issue detection and generation. Built its AI-experience design system and visual identity from scratch.</w:t>
       </w:r>
     </w:p>
     <w:p>
@@ -292,22 +300,7 @@
         <w:rPr>
           <w:lang w:val="en-US"/>
         </w:rPr>
-        <w:t>Also built visual identities and design systems from scratch for AI Assistant for VS Code and ReSharper AI.</w:t>
-      </w:r>
-    </w:p>
-    <w:p>
-      <w:pPr>
-        <w:pStyle w:val="CVBullet"/>
-        <w:numPr>
-          <w:ilvl w:val="0"/>
-          <w:numId w:val="10"/>
-        </w:numPr>
-      </w:pPr>
-      <w:r>
-        <w:rPr>
-          <w:lang w:val="en-US"/>
-        </w:rPr>
-        <w:t>During the Rider product period, surveyed primary-IDE share increased from 35% to 44% as a team-level adoption outcome.</w:t>
+        <w:t>Designed Rider developer workflows and established reusable AI patterns; Monitoring shipped in 2024.1 and 2024.2, with further releases under my subsequent lead role.</w:t>
       </w:r>
     </w:p>
     <w:p>
@@ -345,22 +338,7 @@
         <w:rPr>
           <w:lang w:val="en-US"/>
         </w:rPr>
-        <w:t>Rebuilt TON's public product around four audience activation paths and live network proof; 115 validators were active at relaunch. Also created the TON Foundation and TOP visual identities from scratch.</w:t>
-      </w:r>
-    </w:p>
-    <w:p>
-      <w:pPr>
-        <w:pStyle w:val="CVBullet"/>
-        <w:numPr>
-          <w:ilvl w:val="0"/>
-          <w:numId w:val="10"/>
-        </w:numPr>
-      </w:pPr>
-      <w:r>
-        <w:rPr>
-          <w:lang w:val="en-US"/>
-        </w:rPr>
-        <w:t>Led TON Wallet's onboarding, portfolio, contact-based transfers, exchange, and Telegram integration, including its new visual identity and design system. During that quarter, registered wallets across TON grew from 382,148 to 901,015 (+136%).</w:t>
+        <w:t>Rebuilt TON's public product around audience-specific paths and led TON Wallet's onboarding, portfolio, transfers, exchange and Telegram integration. Created visual identities for TON and TOP, and Wallet's identity and design system.</w:t>
       </w:r>
     </w:p>
     <w:p>
@@ -390,7 +368,7 @@
         <w:rPr>
           <w:lang w:val="en-US"/>
         </w:rPr>
-        <w:t>Built a four-stage portfolio process and guided launch readiness for Getgems and STON.fi; later public scale reached $7.6B volume, 36.4M swaps, and 5.8M users for STON.fi, and 4.5M+ connected wallets for Getgems.</w:t>
+        <w:t>Connected product framing, prototype validation and launch-readiness reviews across the portfolio, including Getgems (April 2022 mainnet launch) and STON.fi (Q3 2022 protocol launch).</w:t>
       </w:r>
     </w:p>
     <w:p>
@@ -428,7 +406,7 @@
         <w:rPr>
           <w:lang w:val="en-US"/>
         </w:rPr>
-        <w:t>Designed linked buyer and seller journeys for Auto.ru Safe Deal after research showed that more than 60% of buyers and one in five sellers needed a safer transaction path; covered four buyer tasks and five seller tasks from agreement through fulfilment.</w:t>
+        <w:t>Designed Safe Deal's linked buyer and seller journeys, from service blueprint and prototype to identity checks, protected payment, handover and recovery across web, mobile and employee tools.</w:t>
       </w:r>
     </w:p>
     <w:p>
@@ -443,7 +421,7 @@
         <w:rPr>
           <w:lang w:val="en-US"/>
         </w:rPr>
-        <w:t>Took the transaction service from research and service blueprint through prototype and cross-functional delivery. Auto.ru launched it with Tinkoff in Oct 2021; the published online process took up to 15 minutes.</w:t>
+        <w:t>Delivered the design before leaving in June 2021; Auto.ru and Tinkoff launched the service in October 2021 with a reported online process of up to 15 minutes.</w:t>
       </w:r>
     </w:p>
     <w:p>
@@ -496,7 +474,7 @@
         <w:rPr>
           <w:lang w:val="en-US"/>
         </w:rPr>
-        <w:t>The rollout expanded issuer coverage from two Mastercard banks to six Visa banks (3x coverage) through a consistent five-state payment model; the platform served 7M+ users during the project period.</w:t>
+        <w:t>Designed for clear device readiness, payment status and safe retry. Public launch context: the November 2020 Visa release supported six banks; Koshelek reported a wider app audience of 16M, not Pay active users.</w:t>
       </w:r>
     </w:p>
     <w:p>
@@ -602,7 +580,7 @@
         <w:rPr>
           <w:lang w:val="en-US"/>
         </w:rPr>
-        <w:t>During the product period, SberMobile grew from 10,000+ first-week connections to 500,000 active subscribers and expanded from 4 to 50 regions.</w:t>
+        <w:t>Aligned banking, telecom, delivery and employee states so customers could track orders and manage the active service. SberMobile was available in 32 regions by April 2019 (public rollout context).</w:t>
       </w:r>
     </w:p>
     <w:p>
@@ -677,7 +655,7 @@
         <w:rPr>
           <w:lang w:val="en-US"/>
         </w:rPr>
-        <w:t>Trust-Calibrated Code Review. Participatory design study on reviewing multi-file changes from LLM agents. JetBrains x Lund University, 2026. https://arxiv.org/abs/2606.01969</w:t>
+        <w:t>Trust-Calibrated Code Review. Participatory design study on reviewing multi-file changes from LLM agents. JetBrains x Lund University, arXiv preprint, June 2026. https://arxiv.org/abs/2606.01969</w:t>
       </w:r>
     </w:p>
     <w:p>

</xml_diff>